<commit_message>
feat(cabinet): add role-based orders and administration
Implement customer, performer, moderator and administrator workflows with
PostgreSQL, Better Auth, private files, order chats, Robokassa payment
verification, earnings and manual withdrawals. Serve the roster and portfolio
from shared data and seed the existing members and works without duplicates.

Add the Node application, database and background worker to the Dokploy
Compose deployment, document setup and recovery, and update the bilingual
terms and privacy policy. Include workflow, access, financial and UI checks.
</commit_message>
<xml_diff>
--- a/public/documents/RESTATIC_Offer_EN.docx
+++ b/public/documents/RESTATIC_Offer_EN.docx
@@ -518,10 +518,10 @@
       <w:r>
         <w:rPr>
           <w:rFonts w:ascii="Times New Roman" w:hAnsi="Times New Roman"/>
-          <w:sz w:val="24"/>
-          <w:color w:val="000000"/>
-        </w:rPr>
-        <w:t xml:space="preserve">3.3. The order states the number of concepts, included revision rounds and feedback period before acceptance. A revision round is one consolidated set of comments on a submitted version. Changes to concept, music, materials or scope outside the brief require separate agreement on price and timing.</w:t>
+          <w:b w:val="0"/>
+          <w:sz w:val="24"/>
+        </w:rPr>
+        <w:t>3.3. The order price includes two revision rounds within the agreed brief. One round is one consolidated set of comments on a submitted version. Changes to concept, music, materials or scope outside the brief require a separate application with an agreed price and schedule.</w:t>
       </w:r>
     </w:p>
     <w:p>
@@ -674,10 +674,10 @@
       <w:r>
         <w:rPr>
           <w:rFonts w:ascii="Times New Roman" w:hAnsi="Times New Roman"/>
-          <w:sz w:val="24"/>
-          <w:color w:val="000000"/>
-        </w:rPr>
-        <w:t xml:space="preserve">4.2. Before acceptance, the order states the total, quote and payment currencies, advance, payment milestones, applicable taxes and known fees. Any currency conversion must specify its rate source and fixing date. Additional work or expenses require separate approval.</w:t>
+          <w:b w:val="0"/>
+          <w:sz w:val="24"/>
+        </w:rPr>
+        <w:t>4.2. The account uses 100% advance payment in Russian rubles after the Client expressly confirms the saved quote containing the brief, price, deliverables, performer and deadline. Payment is made through Robokassa. The payment service displays applicable payment-method and conversion information before payment. An accepted order price cannot change without the Client’s agreement.</w:t>
       </w:r>
     </w:p>
     <w:p>
@@ -1314,26 +1314,10 @@
       <w:r>
         <w:rPr>
           <w:rFonts w:ascii="Times New Roman" w:hAnsi="Times New Roman"/>
-          <w:sz w:val="24"/>
-          <w:color w:val="000000"/>
-        </w:rPr>
-        <w:t xml:space="preserve">9.1. This version, dated 2 October 2026, takes effect on publication. Each order contract runs from acceptance until obligations are fulfilled; rights, confidentiality and liability provisions survive where relevant.</w:t>
-      </w:r>
-      <w:r>
-        <w:rPr>
-          <w:rFonts w:ascii="Times New Roman" w:hAnsi="Times New Roman"/>
-          <w:sz w:val="24"/>
-          <w:color w:val="000000"/>
-        </w:rPr>
-        <w:t xml:space="preserve"/>
-      </w:r>
-      <w:r>
-        <w:rPr>
-          <w:rFonts w:ascii="Times New Roman" w:hAnsi="Times New Roman"/>
-          <w:sz w:val="24"/>
-          <w:color w:val="000000"/>
-        </w:rPr>
-        <w:t xml:space="preserve"/>
+          <w:b w:val="0"/>
+          <w:sz w:val="24"/>
+        </w:rPr>
+        <w:t>9.1. This version, dated 3 October 2026, takes effect on publication. Each order contract runs from acceptance until obligations are fulfilled; rights, confidentiality and liability provisions survive where relevant.</w:t>
       </w:r>
     </w:p>
     <w:p>
@@ -1636,6 +1620,135 @@
           <w:color w:val="000000"/>
         </w:rPr>
         <w:t xml:space="preserve">. Payment details are provided in the confirmed order or invoice.</w:t>
+      </w:r>
+    </w:p>
+    <w:p>
+      <w:pPr>
+        <w:pStyle w:val="a3"/>
+        <w:spacing w:after="0"/>
+        <w:ind w:left="0" w:firstLine="0"/>
+        <w:jc w:val="center"/>
+        <w:rPr>
+          <w:rFonts w:ascii="Times New Roman" w:hAnsi="Times New Roman" w:cs="Times New Roman"/>
+          <w:b/>
+          <w:bCs/>
+          <w:sz w:val="24"/>
+          <w:szCs w:val="24"/>
+        </w:rPr>
+        <w:keepNext/>
+        <w:widowControl/>
+      </w:pPr>
+      <w:r>
+        <w:rPr>
+          <w:rFonts w:ascii="Times New Roman" w:hAnsi="Times New Roman"/>
+          <w:b/>
+          <w:sz w:val="24"/>
+        </w:rPr>
+        <w:t>12 Working through the account</w:t>
+      </w:r>
+    </w:p>
+    <w:p>
+      <w:pPr>
+        <w:pStyle w:val="a3"/>
+        <w:autoSpaceDE w:val="0"/>
+        <w:autoSpaceDN w:val="0"/>
+        <w:adjustRightInd w:val="0"/>
+        <w:spacing w:after="40" w:line="240" w:lineRule="auto"/>
+        <w:ind w:left="0" w:firstLine="0"/>
+        <w:jc w:val="both"/>
+        <w:rPr>
+          <w:rFonts w:ascii="Times New Roman" w:hAnsi="Times New Roman"/>
+          <w:sz w:val="24"/>
+          <w:szCs w:val="24"/>
+          <w:lang w:eastAsia="ru-RU"/>
+        </w:rPr>
+        <w:widowControl/>
+      </w:pPr>
+      <w:r>
+        <w:rPr>
+          <w:rFonts w:ascii="Times New Roman" w:hAnsi="Times New Roman"/>
+          <w:b w:val="0"/>
+          <w:sz w:val="24"/>
+        </w:rPr>
+        <w:t>12.1. An application contains a description, brief, work type, music where needed, materials and an optional preferred performer. A moderator agrees the terms. Without a preference, the system suggests a random available member with a matching specialization; OTHER is assigned by a moderator. The performer confirms the assignment before payment is offered. The Client agrees any replacement of a preferred performer.</w:t>
+      </w:r>
+    </w:p>
+    <w:p>
+      <w:pPr>
+        <w:pStyle w:val="a3"/>
+        <w:autoSpaceDE w:val="0"/>
+        <w:autoSpaceDN w:val="0"/>
+        <w:adjustRightInd w:val="0"/>
+        <w:spacing w:after="40" w:line="240" w:lineRule="auto"/>
+        <w:ind w:left="0" w:firstLine="0"/>
+        <w:jc w:val="both"/>
+        <w:rPr>
+          <w:rFonts w:ascii="Times New Roman" w:hAnsi="Times New Roman"/>
+          <w:sz w:val="24"/>
+          <w:szCs w:val="24"/>
+          <w:lang w:eastAsia="ru-RU"/>
+        </w:rPr>
+        <w:widowControl/>
+      </w:pPr>
+      <w:r>
+        <w:rPr>
+          <w:rFonts w:ascii="Times New Roman" w:hAnsi="Times New Roman"/>
+          <w:b w:val="0"/>
+          <w:sz w:val="24"/>
+        </w:rPr>
+        <w:t>12.2. A performer invitation is valid for 24 hours and a client quote for 7 days. After expiry, terms and performer availability must be confirmed again. The Client communicates with moderators before payment; the performer joins the shared chat after confirmed payment. Previews, finals, revisions and agreed changes are recorded in the account. The accepted terms version and quote are retained for the order.</w:t>
+      </w:r>
+    </w:p>
+    <w:p>
+      <w:pPr>
+        <w:pStyle w:val="a3"/>
+        <w:autoSpaceDE w:val="0"/>
+        <w:autoSpaceDN w:val="0"/>
+        <w:adjustRightInd w:val="0"/>
+        <w:spacing w:after="40" w:line="240" w:lineRule="auto"/>
+        <w:ind w:left="0" w:firstLine="0"/>
+        <w:jc w:val="both"/>
+        <w:rPr>
+          <w:rFonts w:ascii="Times New Roman" w:hAnsi="Times New Roman"/>
+          <w:sz w:val="24"/>
+          <w:szCs w:val="24"/>
+          <w:lang w:eastAsia="ru-RU"/>
+        </w:rPr>
+        <w:widowControl/>
+      </w:pPr>
+      <w:r>
+        <w:rPr>
+          <w:rFonts w:ascii="Times New Roman" w:hAnsi="Times New Roman"/>
+          <w:b w:val="0"/>
+          <w:sz w:val="24"/>
+        </w:rPr>
+        <w:t>12.3. The Client accepts the final in the account or submits specific comments. If the Client does not respond, reminders are sent and the administrator reviews the situation individually, recording the reason for the order-status decision. Silence does not become automatic acceptance or remove mandatory client remedies. Completion does not authorize portfolio publication.</w:t>
+      </w:r>
+    </w:p>
+    <w:p>
+      <w:pPr>
+        <w:pStyle w:val="a3"/>
+        <w:autoSpaceDE w:val="0"/>
+        <w:autoSpaceDN w:val="0"/>
+        <w:adjustRightInd w:val="0"/>
+        <w:spacing w:after="40" w:line="240" w:lineRule="auto"/>
+        <w:ind w:left="0" w:firstLine="0"/>
+        <w:jc w:val="both"/>
+        <w:rPr>
+          <w:rFonts w:ascii="Times New Roman" w:hAnsi="Times New Roman"/>
+          <w:sz w:val="24"/>
+          <w:szCs w:val="24"/>
+          <w:lang w:eastAsia="ru-RU"/>
+        </w:rPr>
+        <w:widowControl/>
+      </w:pPr>
+      <w:r>
+        <w:rPr>
+          <w:rFonts w:ascii="Times New Roman" w:hAnsi="Times New Roman"/>
+          <w:b w:val="0"/>
+          <w:sz w:val="24"/>
+        </w:rPr>
+        <w:t>12.4. Performers access only their assigned orders. A moderator proposes changes to the agreed brief or deadline and the Client confirms them. Cancellation and refund requests are reviewed individually; an account refund record reflects a refund actually performed through the payment service. Robokassa test mode verifies system behavior and does not establish receipt of real money.</w:t>
       </w:r>
     </w:p>
     <w:sectPr>

</xml_diff>